<commit_message>
Modificación Documentos: 1.3 de Araceli Vega y 1.4; Subida de documento 1.3 de Benjamin Mateluna.
</commit_message>
<xml_diff>
--- a/Fase 1/Evidencias Grupales/1.4_APT122_FormativaFase1.docx
+++ b/Fase 1/Evidencias Grupales/1.4_APT122_FormativaFase1.docx
@@ -4641,79 +4641,6 @@
                 <w:rFonts w:asciiTheme="minorHAnsi" w:eastAsiaTheme="minorEastAsia" w:hAnsiTheme="minorHAnsi" w:cstheme="minorBidi"/>
                 <w:b/>
                 <w:bCs/>
-                <w:noProof/>
-                <w:sz w:val="22"/>
-                <w:szCs w:val="22"/>
-              </w:rPr>
-              <mc:AlternateContent>
-                <mc:Choice Requires="wps">
-                  <w:drawing>
-                    <wp:anchor distT="0" distB="0" distL="114300" distR="114300" simplePos="0" relativeHeight="251660288" behindDoc="0" locked="0" layoutInCell="1" allowOverlap="1" wp14:anchorId="4AFF4ECF" wp14:editId="774041A5">
-                      <wp:simplePos x="0" y="0"/>
-                      <wp:positionH relativeFrom="column">
-                        <wp:posOffset>-48260</wp:posOffset>
-                      </wp:positionH>
-                      <wp:positionV relativeFrom="paragraph">
-                        <wp:posOffset>364490</wp:posOffset>
-                      </wp:positionV>
-                      <wp:extent cx="1390650" cy="1238250"/>
-                      <wp:effectExtent l="19050" t="19050" r="19050" b="19050"/>
-                      <wp:wrapNone/>
-                      <wp:docPr id="1187669484" name="Conector recto 5"/>
-                      <wp:cNvGraphicFramePr/>
-                      <a:graphic xmlns:a="http://schemas.openxmlformats.org/drawingml/2006/main">
-                        <a:graphicData uri="http://schemas.microsoft.com/office/word/2010/wordprocessingShape">
-                          <wps:wsp>
-                            <wps:cNvCnPr/>
-                            <wps:spPr>
-                              <a:xfrm flipH="1" flipV="1">
-                                <a:off x="0" y="0"/>
-                                <a:ext cx="1390650" cy="1238250"/>
-                              </a:xfrm>
-                              <a:prstGeom prst="line">
-                                <a:avLst/>
-                              </a:prstGeom>
-                              <a:ln w="38100">
-                                <a:solidFill>
-                                  <a:srgbClr val="00B050"/>
-                                </a:solidFill>
-                              </a:ln>
-                            </wps:spPr>
-                            <wps:style>
-                              <a:lnRef idx="1">
-                                <a:schemeClr val="accent1"/>
-                              </a:lnRef>
-                              <a:fillRef idx="0">
-                                <a:schemeClr val="accent1"/>
-                              </a:fillRef>
-                              <a:effectRef idx="0">
-                                <a:schemeClr val="accent1"/>
-                              </a:effectRef>
-                              <a:fontRef idx="minor">
-                                <a:schemeClr val="tx1"/>
-                              </a:fontRef>
-                            </wps:style>
-                            <wps:bodyPr/>
-                          </wps:wsp>
-                        </a:graphicData>
-                      </a:graphic>
-                    </wp:anchor>
-                  </w:drawing>
-                </mc:Choice>
-                <mc:Fallback>
-                  <w:pict>
-                    <v:line w14:anchorId="56C8C5A4" id="Conector recto 5" o:spid="_x0000_s1026" style="position:absolute;flip:x y;z-index:251660288;visibility:visible;mso-wrap-style:square;mso-wrap-distance-left:9pt;mso-wrap-distance-top:0;mso-wrap-distance-right:9pt;mso-wrap-distance-bottom:0;mso-position-horizontal:absolute;mso-position-horizontal-relative:text;mso-position-vertical:absolute;mso-position-vertical-relative:text" from="-3.8pt,28.7pt" to="105.7pt,126.2pt" o:gfxdata="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" strokecolor="#00b050" strokeweight="3pt">
-                      <v:stroke joinstyle="miter"/>
-                    </v:line>
-                  </w:pict>
-                </mc:Fallback>
-              </mc:AlternateContent>
-            </w:r>
-            <w:r>
-              <w:rPr>
-                <w:rFonts w:asciiTheme="minorHAnsi" w:eastAsiaTheme="minorEastAsia" w:hAnsiTheme="minorHAnsi" w:cstheme="minorBidi"/>
-                <w:b/>
-                <w:bCs/>
                 <w:sz w:val="22"/>
                 <w:szCs w:val="22"/>
               </w:rPr>
@@ -5022,77 +4949,6 @@
             <w:r>
               <w:rPr>
                 <w:rFonts w:asciiTheme="minorHAnsi" w:eastAsiaTheme="minorEastAsia" w:hAnsiTheme="minorHAnsi" w:cstheme="minorBidi"/>
-                <w:noProof/>
-                <w:color w:val="3B3838" w:themeColor="background2" w:themeShade="40"/>
-                <w:lang w:eastAsia="es-CL"/>
-              </w:rPr>
-              <mc:AlternateContent>
-                <mc:Choice Requires="wps">
-                  <w:drawing>
-                    <wp:anchor distT="0" distB="0" distL="114300" distR="114300" simplePos="0" relativeHeight="251659264" behindDoc="0" locked="0" layoutInCell="1" allowOverlap="1" wp14:anchorId="5AB1B274" wp14:editId="00B70CB9">
-                      <wp:simplePos x="0" y="0"/>
-                      <wp:positionH relativeFrom="column">
-                        <wp:posOffset>1761490</wp:posOffset>
-                      </wp:positionH>
-                      <wp:positionV relativeFrom="paragraph">
-                        <wp:posOffset>10160</wp:posOffset>
-                      </wp:positionV>
-                      <wp:extent cx="1466850" cy="1247775"/>
-                      <wp:effectExtent l="19050" t="19050" r="19050" b="28575"/>
-                      <wp:wrapNone/>
-                      <wp:docPr id="1424396228" name="Conector recto 4"/>
-                      <wp:cNvGraphicFramePr/>
-                      <a:graphic xmlns:a="http://schemas.openxmlformats.org/drawingml/2006/main">
-                        <a:graphicData uri="http://schemas.microsoft.com/office/word/2010/wordprocessingShape">
-                          <wps:wsp>
-                            <wps:cNvCnPr/>
-                            <wps:spPr>
-                              <a:xfrm flipV="1">
-                                <a:off x="0" y="0"/>
-                                <a:ext cx="1466850" cy="1247775"/>
-                              </a:xfrm>
-                              <a:prstGeom prst="line">
-                                <a:avLst/>
-                              </a:prstGeom>
-                              <a:ln w="38100">
-                                <a:solidFill>
-                                  <a:srgbClr val="00B050"/>
-                                </a:solidFill>
-                              </a:ln>
-                            </wps:spPr>
-                            <wps:style>
-                              <a:lnRef idx="1">
-                                <a:schemeClr val="accent1"/>
-                              </a:lnRef>
-                              <a:fillRef idx="0">
-                                <a:schemeClr val="accent1"/>
-                              </a:fillRef>
-                              <a:effectRef idx="0">
-                                <a:schemeClr val="accent1"/>
-                              </a:effectRef>
-                              <a:fontRef idx="minor">
-                                <a:schemeClr val="tx1"/>
-                              </a:fontRef>
-                            </wps:style>
-                            <wps:bodyPr/>
-                          </wps:wsp>
-                        </a:graphicData>
-                      </a:graphic>
-                    </wp:anchor>
-                  </w:drawing>
-                </mc:Choice>
-                <mc:Fallback>
-                  <w:pict>
-                    <v:line w14:anchorId="0D27CAFB" id="Conector recto 4" o:spid="_x0000_s1026" style="position:absolute;flip:y;z-index:251659264;visibility:visible;mso-wrap-style:square;mso-wrap-distance-left:9pt;mso-wrap-distance-top:0;mso-wrap-distance-right:9pt;mso-wrap-distance-bottom:0;mso-position-horizontal:absolute;mso-position-horizontal-relative:text;mso-position-vertical:absolute;mso-position-vertical-relative:text" from="138.7pt,.8pt" to="254.2pt,99.05pt" o:gfxdata="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" strokecolor="#00b050" strokeweight="3pt">
-                      <v:stroke joinstyle="miter"/>
-                    </v:line>
-                  </w:pict>
-                </mc:Fallback>
-              </mc:AlternateContent>
-            </w:r>
-            <w:r>
-              <w:rPr>
-                <w:rFonts w:asciiTheme="minorHAnsi" w:eastAsiaTheme="minorEastAsia" w:hAnsiTheme="minorHAnsi" w:cstheme="minorBidi"/>
                 <w:color w:val="3B3838" w:themeColor="background2" w:themeShade="40"/>
                 <w:lang w:eastAsia="es-CL"/>
               </w:rPr>
@@ -5149,84 +5005,7 @@
                 <w:color w:val="3B3838" w:themeColor="background2" w:themeShade="40"/>
               </w:rPr>
               <w:lastRenderedPageBreak/>
-              <w:t xml:space="preserve">relación con el campo </w:t>
-            </w:r>
-            <w:r>
-              <w:rPr>
-                <w:rFonts w:asciiTheme="minorHAnsi" w:eastAsiaTheme="minorEastAsia" w:hAnsiTheme="minorHAnsi" w:cstheme="minorBidi"/>
-                <w:noProof/>
-                <w:color w:val="3B3838" w:themeColor="background2" w:themeShade="40"/>
-              </w:rPr>
-              <mc:AlternateContent>
-                <mc:Choice Requires="wps">
-                  <w:drawing>
-                    <wp:anchor distT="0" distB="0" distL="114300" distR="114300" simplePos="0" relativeHeight="251661312" behindDoc="0" locked="0" layoutInCell="1" allowOverlap="1" wp14:anchorId="1DC5BA4A" wp14:editId="33522EBC">
-                      <wp:simplePos x="0" y="0"/>
-                      <wp:positionH relativeFrom="column">
-                        <wp:posOffset>-1505586</wp:posOffset>
-                      </wp:positionH>
-                      <wp:positionV relativeFrom="paragraph">
-                        <wp:posOffset>1231265</wp:posOffset>
-                      </wp:positionV>
-                      <wp:extent cx="1419225" cy="1581150"/>
-                      <wp:effectExtent l="19050" t="19050" r="28575" b="19050"/>
-                      <wp:wrapNone/>
-                      <wp:docPr id="2011316654" name="Conector recto 6"/>
-                      <wp:cNvGraphicFramePr/>
-                      <a:graphic xmlns:a="http://schemas.openxmlformats.org/drawingml/2006/main">
-                        <a:graphicData uri="http://schemas.microsoft.com/office/word/2010/wordprocessingShape">
-                          <wps:wsp>
-                            <wps:cNvCnPr/>
-                            <wps:spPr>
-                              <a:xfrm flipV="1">
-                                <a:off x="0" y="0"/>
-                                <a:ext cx="1419225" cy="1581150"/>
-                              </a:xfrm>
-                              <a:prstGeom prst="line">
-                                <a:avLst/>
-                              </a:prstGeom>
-                              <a:ln w="38100">
-                                <a:solidFill>
-                                  <a:srgbClr val="00B050"/>
-                                </a:solidFill>
-                              </a:ln>
-                            </wps:spPr>
-                            <wps:style>
-                              <a:lnRef idx="1">
-                                <a:schemeClr val="accent1"/>
-                              </a:lnRef>
-                              <a:fillRef idx="0">
-                                <a:schemeClr val="accent1"/>
-                              </a:fillRef>
-                              <a:effectRef idx="0">
-                                <a:schemeClr val="accent1"/>
-                              </a:effectRef>
-                              <a:fontRef idx="minor">
-                                <a:schemeClr val="tx1"/>
-                              </a:fontRef>
-                            </wps:style>
-                            <wps:bodyPr/>
-                          </wps:wsp>
-                        </a:graphicData>
-                      </a:graphic>
-                    </wp:anchor>
-                  </w:drawing>
-                </mc:Choice>
-                <mc:Fallback>
-                  <w:pict>
-                    <v:line w14:anchorId="7F4D71AF" id="Conector recto 6" o:spid="_x0000_s1026" style="position:absolute;flip:y;z-index:251661312;visibility:visible;mso-wrap-style:square;mso-wrap-distance-left:9pt;mso-wrap-distance-top:0;mso-wrap-distance-right:9pt;mso-wrap-distance-bottom:0;mso-position-horizontal:absolute;mso-position-horizontal-relative:text;mso-position-vertical:absolute;mso-position-vertical-relative:text" from="-118.55pt,96.95pt" to="-6.8pt,221.45pt" o:gfxdata="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" strokecolor="#00b050" strokeweight="3pt">
-                      <v:stroke joinstyle="miter"/>
-                    </v:line>
-                  </w:pict>
-                </mc:Fallback>
-              </mc:AlternateContent>
-            </w:r>
-            <w:r>
-              <w:rPr>
-                <w:rFonts w:asciiTheme="minorHAnsi" w:eastAsiaTheme="minorEastAsia" w:hAnsiTheme="minorHAnsi" w:cstheme="minorBidi"/>
-                <w:color w:val="3B3838" w:themeColor="background2" w:themeShade="40"/>
-              </w:rPr>
-              <w:t>laboral de su carrera</w:t>
+              <w:t>relación con el campo laboral de su carrera</w:t>
             </w:r>
             <w:r>
               <w:rPr>
@@ -5369,85 +5148,6 @@
             <w:r>
               <w:rPr>
                 <w:rFonts w:asciiTheme="minorHAnsi" w:eastAsiaTheme="minorEastAsia" w:hAnsiTheme="minorHAnsi" w:cstheme="minorBidi"/>
-                <w:b/>
-                <w:bCs/>
-                <w:noProof/>
-                <w:sz w:val="22"/>
-                <w:szCs w:val="22"/>
-              </w:rPr>
-              <mc:AlternateContent>
-                <mc:Choice Requires="wps">
-                  <w:drawing>
-                    <wp:anchor distT="0" distB="0" distL="114300" distR="114300" simplePos="0" relativeHeight="251663360" behindDoc="0" locked="0" layoutInCell="1" allowOverlap="1" wp14:anchorId="360FD934" wp14:editId="50FC207A">
-                      <wp:simplePos x="0" y="0"/>
-                      <wp:positionH relativeFrom="column">
-                        <wp:posOffset>-86361</wp:posOffset>
-                      </wp:positionH>
-                      <wp:positionV relativeFrom="paragraph">
-                        <wp:posOffset>-10160</wp:posOffset>
-                      </wp:positionV>
-                      <wp:extent cx="1438275" cy="1581150"/>
-                      <wp:effectExtent l="19050" t="19050" r="28575" b="19050"/>
-                      <wp:wrapNone/>
-                      <wp:docPr id="1446515750" name="Conector recto 5"/>
-                      <wp:cNvGraphicFramePr/>
-                      <a:graphic xmlns:a="http://schemas.openxmlformats.org/drawingml/2006/main">
-                        <a:graphicData uri="http://schemas.microsoft.com/office/word/2010/wordprocessingShape">
-                          <wps:wsp>
-                            <wps:cNvCnPr/>
-                            <wps:spPr>
-                              <a:xfrm flipH="1" flipV="1">
-                                <a:off x="0" y="0"/>
-                                <a:ext cx="1438275" cy="1581150"/>
-                              </a:xfrm>
-                              <a:prstGeom prst="line">
-                                <a:avLst/>
-                              </a:prstGeom>
-                              <a:ln w="38100">
-                                <a:solidFill>
-                                  <a:srgbClr val="00B050"/>
-                                </a:solidFill>
-                              </a:ln>
-                            </wps:spPr>
-                            <wps:style>
-                              <a:lnRef idx="1">
-                                <a:schemeClr val="accent1"/>
-                              </a:lnRef>
-                              <a:fillRef idx="0">
-                                <a:schemeClr val="accent1"/>
-                              </a:fillRef>
-                              <a:effectRef idx="0">
-                                <a:schemeClr val="accent1"/>
-                              </a:effectRef>
-                              <a:fontRef idx="minor">
-                                <a:schemeClr val="tx1"/>
-                              </a:fontRef>
-                            </wps:style>
-                            <wps:bodyPr/>
-                          </wps:wsp>
-                        </a:graphicData>
-                      </a:graphic>
-                      <wp14:sizeRelH relativeFrom="margin">
-                        <wp14:pctWidth>0</wp14:pctWidth>
-                      </wp14:sizeRelH>
-                      <wp14:sizeRelV relativeFrom="margin">
-                        <wp14:pctHeight>0</wp14:pctHeight>
-                      </wp14:sizeRelV>
-                    </wp:anchor>
-                  </w:drawing>
-                </mc:Choice>
-                <mc:Fallback>
-                  <w:pict>
-                    <v:line w14:anchorId="7F8C1D5E" id="Conector recto 5" o:spid="_x0000_s1026" style="position:absolute;flip:x y;z-index:251663360;visibility:visible;mso-wrap-style:square;mso-width-percent:0;mso-height-percent:0;mso-wrap-distance-left:9pt;mso-wrap-distance-top:0;mso-wrap-distance-right:9pt;mso-wrap-distance-bottom:0;mso-position-horizontal:absolute;mso-position-horizontal-relative:text;mso-position-vertical:absolute;mso-position-vertical-relative:text;mso-width-percent:0;mso-height-percent:0;mso-width-relative:margin;mso-height-relative:margin" from="-6.8pt,-.8pt" to="106.45pt,123.7pt" o:gfxdata="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" strokecolor="#00b050" strokeweight="3pt">
-                      <v:stroke joinstyle="miter"/>
-                    </v:line>
-                  </w:pict>
-                </mc:Fallback>
-              </mc:AlternateContent>
-            </w:r>
-            <w:r>
-              <w:rPr>
-                <w:rFonts w:asciiTheme="minorHAnsi" w:eastAsiaTheme="minorEastAsia" w:hAnsiTheme="minorHAnsi" w:cstheme="minorBidi"/>
                 <w:color w:val="3B3838" w:themeColor="background2" w:themeShade="40"/>
               </w:rPr>
               <w:t xml:space="preserve">Describe una relación coherente entre su proyecto y el perfil de egreso de su plan de estudio, especificando cómo debe utilizar distintas competencias para desarrollar su Proyecto APT. </w:t>
@@ -5624,161 +5324,6 @@
             <w:r>
               <w:rPr>
                 <w:rFonts w:asciiTheme="minorHAnsi" w:eastAsiaTheme="minorEastAsia" w:hAnsiTheme="minorHAnsi" w:cstheme="minorBidi"/>
-                <w:noProof/>
-                <w:color w:val="3B3838" w:themeColor="background2" w:themeShade="40"/>
-              </w:rPr>
-              <mc:AlternateContent>
-                <mc:Choice Requires="wps">
-                  <w:drawing>
-                    <wp:anchor distT="0" distB="0" distL="114300" distR="114300" simplePos="0" relativeHeight="251667456" behindDoc="0" locked="0" layoutInCell="1" allowOverlap="1" wp14:anchorId="270060EE" wp14:editId="5CC274C7">
-                      <wp:simplePos x="0" y="0"/>
-                      <wp:positionH relativeFrom="column">
-                        <wp:posOffset>-86360</wp:posOffset>
-                      </wp:positionH>
-                      <wp:positionV relativeFrom="paragraph">
-                        <wp:posOffset>-4445</wp:posOffset>
-                      </wp:positionV>
-                      <wp:extent cx="1409700" cy="762000"/>
-                      <wp:effectExtent l="19050" t="19050" r="19050" b="19050"/>
-                      <wp:wrapNone/>
-                      <wp:docPr id="175792753" name="Conector recto 6"/>
-                      <wp:cNvGraphicFramePr/>
-                      <a:graphic xmlns:a="http://schemas.openxmlformats.org/drawingml/2006/main">
-                        <a:graphicData uri="http://schemas.microsoft.com/office/word/2010/wordprocessingShape">
-                          <wps:wsp>
-                            <wps:cNvCnPr/>
-                            <wps:spPr>
-                              <a:xfrm flipV="1">
-                                <a:off x="0" y="0"/>
-                                <a:ext cx="1409700" cy="762000"/>
-                              </a:xfrm>
-                              <a:prstGeom prst="line">
-                                <a:avLst/>
-                              </a:prstGeom>
-                              <a:ln w="38100">
-                                <a:solidFill>
-                                  <a:srgbClr val="00B050"/>
-                                </a:solidFill>
-                              </a:ln>
-                            </wps:spPr>
-                            <wps:style>
-                              <a:lnRef idx="1">
-                                <a:schemeClr val="accent1"/>
-                              </a:lnRef>
-                              <a:fillRef idx="0">
-                                <a:schemeClr val="accent1"/>
-                              </a:fillRef>
-                              <a:effectRef idx="0">
-                                <a:schemeClr val="accent1"/>
-                              </a:effectRef>
-                              <a:fontRef idx="minor">
-                                <a:schemeClr val="tx1"/>
-                              </a:fontRef>
-                            </wps:style>
-                            <wps:bodyPr/>
-                          </wps:wsp>
-                        </a:graphicData>
-                      </a:graphic>
-                      <wp14:sizeRelH relativeFrom="margin">
-                        <wp14:pctWidth>0</wp14:pctWidth>
-                      </wp14:sizeRelH>
-                      <wp14:sizeRelV relativeFrom="margin">
-                        <wp14:pctHeight>0</wp14:pctHeight>
-                      </wp14:sizeRelV>
-                    </wp:anchor>
-                  </w:drawing>
-                </mc:Choice>
-                <mc:Fallback>
-                  <w:pict>
-                    <v:line w14:anchorId="56E79E8A" id="Conector recto 6" o:spid="_x0000_s1026" style="position:absolute;flip:y;z-index:251667456;visibility:visible;mso-wrap-style:square;mso-width-percent:0;mso-height-percent:0;mso-wrap-distance-left:9pt;mso-wrap-distance-top:0;mso-wrap-distance-right:9pt;mso-wrap-distance-bottom:0;mso-position-horizontal:absolute;mso-position-horizontal-relative:text;mso-position-vertical:absolute;mso-position-vertical-relative:text;mso-width-percent:0;mso-height-percent:0;mso-width-relative:margin;mso-height-relative:margin" from="-6.8pt,-.35pt" to="104.2pt,59.65pt" o:gfxdata="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" strokecolor="#00b050" strokeweight="3pt">
-                      <v:stroke joinstyle="miter"/>
-                    </v:line>
-                  </w:pict>
-                </mc:Fallback>
-              </mc:AlternateContent>
-            </w:r>
-            <w:r>
-              <w:rPr>
-                <w:rFonts w:asciiTheme="minorHAnsi" w:eastAsiaTheme="minorEastAsia" w:hAnsiTheme="minorHAnsi" w:cstheme="minorBidi"/>
-                <w:b/>
-                <w:bCs/>
-                <w:noProof/>
-                <w:sz w:val="22"/>
-                <w:szCs w:val="22"/>
-              </w:rPr>
-              <mc:AlternateContent>
-                <mc:Choice Requires="wps">
-                  <w:drawing>
-                    <wp:anchor distT="0" distB="0" distL="114300" distR="114300" simplePos="0" relativeHeight="251665408" behindDoc="0" locked="0" layoutInCell="1" allowOverlap="1" wp14:anchorId="604602DB" wp14:editId="08F439C3">
-                      <wp:simplePos x="0" y="0"/>
-                      <wp:positionH relativeFrom="column">
-                        <wp:posOffset>-67311</wp:posOffset>
-                      </wp:positionH>
-                      <wp:positionV relativeFrom="paragraph">
-                        <wp:posOffset>-4445</wp:posOffset>
-                      </wp:positionV>
-                      <wp:extent cx="1447800" cy="790575"/>
-                      <wp:effectExtent l="19050" t="19050" r="19050" b="28575"/>
-                      <wp:wrapNone/>
-                      <wp:docPr id="2128436996" name="Conector recto 5"/>
-                      <wp:cNvGraphicFramePr/>
-                      <a:graphic xmlns:a="http://schemas.openxmlformats.org/drawingml/2006/main">
-                        <a:graphicData uri="http://schemas.microsoft.com/office/word/2010/wordprocessingShape">
-                          <wps:wsp>
-                            <wps:cNvCnPr/>
-                            <wps:spPr>
-                              <a:xfrm flipH="1" flipV="1">
-                                <a:off x="0" y="0"/>
-                                <a:ext cx="1447800" cy="790575"/>
-                              </a:xfrm>
-                              <a:prstGeom prst="line">
-                                <a:avLst/>
-                              </a:prstGeom>
-                              <a:ln w="38100">
-                                <a:solidFill>
-                                  <a:srgbClr val="00B050"/>
-                                </a:solidFill>
-                              </a:ln>
-                            </wps:spPr>
-                            <wps:style>
-                              <a:lnRef idx="1">
-                                <a:schemeClr val="accent1"/>
-                              </a:lnRef>
-                              <a:fillRef idx="0">
-                                <a:schemeClr val="accent1"/>
-                              </a:fillRef>
-                              <a:effectRef idx="0">
-                                <a:schemeClr val="accent1"/>
-                              </a:effectRef>
-                              <a:fontRef idx="minor">
-                                <a:schemeClr val="tx1"/>
-                              </a:fontRef>
-                            </wps:style>
-                            <wps:bodyPr/>
-                          </wps:wsp>
-                        </a:graphicData>
-                      </a:graphic>
-                      <wp14:sizeRelH relativeFrom="margin">
-                        <wp14:pctWidth>0</wp14:pctWidth>
-                      </wp14:sizeRelH>
-                      <wp14:sizeRelV relativeFrom="margin">
-                        <wp14:pctHeight>0</wp14:pctHeight>
-                      </wp14:sizeRelV>
-                    </wp:anchor>
-                  </w:drawing>
-                </mc:Choice>
-                <mc:Fallback>
-                  <w:pict>
-                    <v:line w14:anchorId="49DB1DA6" id="Conector recto 5" o:spid="_x0000_s1026" style="position:absolute;flip:x y;z-index:251665408;visibility:visible;mso-wrap-style:square;mso-width-percent:0;mso-height-percent:0;mso-wrap-distance-left:9pt;mso-wrap-distance-top:0;mso-wrap-distance-right:9pt;mso-wrap-distance-bottom:0;mso-position-horizontal:absolute;mso-position-horizontal-relative:text;mso-position-vertical:absolute;mso-position-vertical-relative:text;mso-width-percent:0;mso-height-percent:0;mso-width-relative:margin;mso-height-relative:margin" from="-5.3pt,-.35pt" to="108.7pt,61.9pt" o:gfxdata="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" strokecolor="#00b050" strokeweight="3pt">
-                      <v:stroke joinstyle="miter"/>
-                    </v:line>
-                  </w:pict>
-                </mc:Fallback>
-              </mc:AlternateContent>
-            </w:r>
-            <w:r>
-              <w:rPr>
-                <w:rFonts w:asciiTheme="minorHAnsi" w:eastAsiaTheme="minorEastAsia" w:hAnsiTheme="minorHAnsi" w:cstheme="minorBidi"/>
                 <w:color w:val="3B3838" w:themeColor="background2" w:themeShade="40"/>
               </w:rPr>
               <w:t xml:space="preserve">Menciona sus intereses profesionales y explica con claridad cómo estos se ven reflejados en su proyecto. </w:t>
@@ -5932,161 +5477,6 @@
             <w:r>
               <w:rPr>
                 <w:rFonts w:asciiTheme="minorHAnsi" w:eastAsiaTheme="minorEastAsia" w:hAnsiTheme="minorHAnsi" w:cstheme="minorBidi"/>
-                <w:noProof/>
-                <w:color w:val="3B3838" w:themeColor="background2" w:themeShade="40"/>
-              </w:rPr>
-              <mc:AlternateContent>
-                <mc:Choice Requires="wps">
-                  <w:drawing>
-                    <wp:anchor distT="0" distB="0" distL="114300" distR="114300" simplePos="0" relativeHeight="251671552" behindDoc="0" locked="0" layoutInCell="1" allowOverlap="1" wp14:anchorId="7620FE9E" wp14:editId="64C2582B">
-                      <wp:simplePos x="0" y="0"/>
-                      <wp:positionH relativeFrom="column">
-                        <wp:posOffset>-105411</wp:posOffset>
-                      </wp:positionH>
-                      <wp:positionV relativeFrom="paragraph">
-                        <wp:posOffset>-14605</wp:posOffset>
-                      </wp:positionV>
-                      <wp:extent cx="1457325" cy="1724025"/>
-                      <wp:effectExtent l="19050" t="19050" r="28575" b="28575"/>
-                      <wp:wrapNone/>
-                      <wp:docPr id="2047123579" name="Conector recto 6"/>
-                      <wp:cNvGraphicFramePr/>
-                      <a:graphic xmlns:a="http://schemas.openxmlformats.org/drawingml/2006/main">
-                        <a:graphicData uri="http://schemas.microsoft.com/office/word/2010/wordprocessingShape">
-                          <wps:wsp>
-                            <wps:cNvCnPr/>
-                            <wps:spPr>
-                              <a:xfrm flipV="1">
-                                <a:off x="0" y="0"/>
-                                <a:ext cx="1457325" cy="1724025"/>
-                              </a:xfrm>
-                              <a:prstGeom prst="line">
-                                <a:avLst/>
-                              </a:prstGeom>
-                              <a:ln w="38100">
-                                <a:solidFill>
-                                  <a:srgbClr val="00B050"/>
-                                </a:solidFill>
-                              </a:ln>
-                            </wps:spPr>
-                            <wps:style>
-                              <a:lnRef idx="1">
-                                <a:schemeClr val="accent1"/>
-                              </a:lnRef>
-                              <a:fillRef idx="0">
-                                <a:schemeClr val="accent1"/>
-                              </a:fillRef>
-                              <a:effectRef idx="0">
-                                <a:schemeClr val="accent1"/>
-                              </a:effectRef>
-                              <a:fontRef idx="minor">
-                                <a:schemeClr val="tx1"/>
-                              </a:fontRef>
-                            </wps:style>
-                            <wps:bodyPr/>
-                          </wps:wsp>
-                        </a:graphicData>
-                      </a:graphic>
-                      <wp14:sizeRelH relativeFrom="margin">
-                        <wp14:pctWidth>0</wp14:pctWidth>
-                      </wp14:sizeRelH>
-                      <wp14:sizeRelV relativeFrom="margin">
-                        <wp14:pctHeight>0</wp14:pctHeight>
-                      </wp14:sizeRelV>
-                    </wp:anchor>
-                  </w:drawing>
-                </mc:Choice>
-                <mc:Fallback>
-                  <w:pict>
-                    <v:line w14:anchorId="1404692E" id="Conector recto 6" o:spid="_x0000_s1026" style="position:absolute;flip:y;z-index:251671552;visibility:visible;mso-wrap-style:square;mso-width-percent:0;mso-height-percent:0;mso-wrap-distance-left:9pt;mso-wrap-distance-top:0;mso-wrap-distance-right:9pt;mso-wrap-distance-bottom:0;mso-position-horizontal:absolute;mso-position-horizontal-relative:text;mso-position-vertical:absolute;mso-position-vertical-relative:text;mso-width-percent:0;mso-height-percent:0;mso-width-relative:margin;mso-height-relative:margin" from="-8.3pt,-1.15pt" to="106.45pt,134.6pt" o:gfxdata="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" strokecolor="#00b050" strokeweight="3pt">
-                      <v:stroke joinstyle="miter"/>
-                    </v:line>
-                  </w:pict>
-                </mc:Fallback>
-              </mc:AlternateContent>
-            </w:r>
-            <w:r>
-              <w:rPr>
-                <w:rFonts w:asciiTheme="minorHAnsi" w:eastAsiaTheme="minorEastAsia" w:hAnsiTheme="minorHAnsi" w:cstheme="minorBidi"/>
-                <w:b/>
-                <w:bCs/>
-                <w:noProof/>
-                <w:sz w:val="22"/>
-                <w:szCs w:val="22"/>
-              </w:rPr>
-              <mc:AlternateContent>
-                <mc:Choice Requires="wps">
-                  <w:drawing>
-                    <wp:anchor distT="0" distB="0" distL="114300" distR="114300" simplePos="0" relativeHeight="251669504" behindDoc="0" locked="0" layoutInCell="1" allowOverlap="1" wp14:anchorId="3056A828" wp14:editId="77DD22B8">
-                      <wp:simplePos x="0" y="0"/>
-                      <wp:positionH relativeFrom="column">
-                        <wp:posOffset>-86360</wp:posOffset>
-                      </wp:positionH>
-                      <wp:positionV relativeFrom="paragraph">
-                        <wp:posOffset>4444</wp:posOffset>
-                      </wp:positionV>
-                      <wp:extent cx="1428750" cy="1704975"/>
-                      <wp:effectExtent l="19050" t="19050" r="19050" b="28575"/>
-                      <wp:wrapNone/>
-                      <wp:docPr id="505063875" name="Conector recto 5"/>
-                      <wp:cNvGraphicFramePr/>
-                      <a:graphic xmlns:a="http://schemas.openxmlformats.org/drawingml/2006/main">
-                        <a:graphicData uri="http://schemas.microsoft.com/office/word/2010/wordprocessingShape">
-                          <wps:wsp>
-                            <wps:cNvCnPr/>
-                            <wps:spPr>
-                              <a:xfrm flipH="1" flipV="1">
-                                <a:off x="0" y="0"/>
-                                <a:ext cx="1428750" cy="1704975"/>
-                              </a:xfrm>
-                              <a:prstGeom prst="line">
-                                <a:avLst/>
-                              </a:prstGeom>
-                              <a:ln w="38100">
-                                <a:solidFill>
-                                  <a:srgbClr val="00B050"/>
-                                </a:solidFill>
-                              </a:ln>
-                            </wps:spPr>
-                            <wps:style>
-                              <a:lnRef idx="1">
-                                <a:schemeClr val="accent1"/>
-                              </a:lnRef>
-                              <a:fillRef idx="0">
-                                <a:schemeClr val="accent1"/>
-                              </a:fillRef>
-                              <a:effectRef idx="0">
-                                <a:schemeClr val="accent1"/>
-                              </a:effectRef>
-                              <a:fontRef idx="minor">
-                                <a:schemeClr val="tx1"/>
-                              </a:fontRef>
-                            </wps:style>
-                            <wps:bodyPr/>
-                          </wps:wsp>
-                        </a:graphicData>
-                      </a:graphic>
-                      <wp14:sizeRelH relativeFrom="margin">
-                        <wp14:pctWidth>0</wp14:pctWidth>
-                      </wp14:sizeRelH>
-                      <wp14:sizeRelV relativeFrom="margin">
-                        <wp14:pctHeight>0</wp14:pctHeight>
-                      </wp14:sizeRelV>
-                    </wp:anchor>
-                  </w:drawing>
-                </mc:Choice>
-                <mc:Fallback>
-                  <w:pict>
-                    <v:line w14:anchorId="6E87F3DA" id="Conector recto 5" o:spid="_x0000_s1026" style="position:absolute;flip:x y;z-index:251669504;visibility:visible;mso-wrap-style:square;mso-width-percent:0;mso-height-percent:0;mso-wrap-distance-left:9pt;mso-wrap-distance-top:0;mso-wrap-distance-right:9pt;mso-wrap-distance-bottom:0;mso-position-horizontal:absolute;mso-position-horizontal-relative:text;mso-position-vertical:absolute;mso-position-vertical-relative:text;mso-width-percent:0;mso-height-percent:0;mso-width-relative:margin;mso-height-relative:margin" from="-6.8pt,.35pt" to="105.7pt,134.6pt" o:gfxdata="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" strokecolor="#00b050" strokeweight="3pt">
-                      <v:stroke joinstyle="miter"/>
-                    </v:line>
-                  </w:pict>
-                </mc:Fallback>
-              </mc:AlternateContent>
-            </w:r>
-            <w:r>
-              <w:rPr>
-                <w:rFonts w:asciiTheme="minorHAnsi" w:eastAsiaTheme="minorEastAsia" w:hAnsiTheme="minorHAnsi" w:cstheme="minorBidi"/>
                 <w:color w:val="3B3838" w:themeColor="background2" w:themeShade="40"/>
               </w:rPr>
               <w:t>Justifica por qué el proyecto puede desarrollarse considerado tiempo, materiales y factores externos, y en caso de posibles dificultades plantea como las abordaría.</w:t>
@@ -6322,164 +5712,9 @@
             <w:r>
               <w:rPr>
                 <w:rFonts w:asciiTheme="minorHAnsi" w:eastAsiaTheme="minorEastAsia" w:hAnsiTheme="minorHAnsi" w:cstheme="minorBidi"/>
-                <w:noProof/>
-                <w:color w:val="3B3838" w:themeColor="background2" w:themeShade="40"/>
+                <w:lang w:eastAsia="es-CL"/>
               </w:rPr>
               <w:lastRenderedPageBreak/>
-              <mc:AlternateContent>
-                <mc:Choice Requires="wps">
-                  <w:drawing>
-                    <wp:anchor distT="0" distB="0" distL="114300" distR="114300" simplePos="0" relativeHeight="251675648" behindDoc="0" locked="0" layoutInCell="1" allowOverlap="1" wp14:anchorId="41586B82" wp14:editId="7880E9B6">
-                      <wp:simplePos x="0" y="0"/>
-                      <wp:positionH relativeFrom="column">
-                        <wp:posOffset>-67310</wp:posOffset>
-                      </wp:positionH>
-                      <wp:positionV relativeFrom="paragraph">
-                        <wp:posOffset>-2540</wp:posOffset>
-                      </wp:positionV>
-                      <wp:extent cx="1419225" cy="714375"/>
-                      <wp:effectExtent l="19050" t="19050" r="28575" b="28575"/>
-                      <wp:wrapNone/>
-                      <wp:docPr id="1176202057" name="Conector recto 6"/>
-                      <wp:cNvGraphicFramePr/>
-                      <a:graphic xmlns:a="http://schemas.openxmlformats.org/drawingml/2006/main">
-                        <a:graphicData uri="http://schemas.microsoft.com/office/word/2010/wordprocessingShape">
-                          <wps:wsp>
-                            <wps:cNvCnPr/>
-                            <wps:spPr>
-                              <a:xfrm flipV="1">
-                                <a:off x="0" y="0"/>
-                                <a:ext cx="1419225" cy="714375"/>
-                              </a:xfrm>
-                              <a:prstGeom prst="line">
-                                <a:avLst/>
-                              </a:prstGeom>
-                              <a:ln w="38100">
-                                <a:solidFill>
-                                  <a:srgbClr val="00B050"/>
-                                </a:solidFill>
-                              </a:ln>
-                            </wps:spPr>
-                            <wps:style>
-                              <a:lnRef idx="1">
-                                <a:schemeClr val="accent1"/>
-                              </a:lnRef>
-                              <a:fillRef idx="0">
-                                <a:schemeClr val="accent1"/>
-                              </a:fillRef>
-                              <a:effectRef idx="0">
-                                <a:schemeClr val="accent1"/>
-                              </a:effectRef>
-                              <a:fontRef idx="minor">
-                                <a:schemeClr val="tx1"/>
-                              </a:fontRef>
-                            </wps:style>
-                            <wps:bodyPr/>
-                          </wps:wsp>
-                        </a:graphicData>
-                      </a:graphic>
-                      <wp14:sizeRelH relativeFrom="margin">
-                        <wp14:pctWidth>0</wp14:pctWidth>
-                      </wp14:sizeRelH>
-                      <wp14:sizeRelV relativeFrom="margin">
-                        <wp14:pctHeight>0</wp14:pctHeight>
-                      </wp14:sizeRelV>
-                    </wp:anchor>
-                  </w:drawing>
-                </mc:Choice>
-                <mc:Fallback>
-                  <w:pict>
-                    <v:line w14:anchorId="74F0045C" id="Conector recto 6" o:spid="_x0000_s1026" style="position:absolute;flip:y;z-index:251675648;visibility:visible;mso-wrap-style:square;mso-width-percent:0;mso-height-percent:0;mso-wrap-distance-left:9pt;mso-wrap-distance-top:0;mso-wrap-distance-right:9pt;mso-wrap-distance-bottom:0;mso-position-horizontal:absolute;mso-position-horizontal-relative:text;mso-position-vertical:absolute;mso-position-vertical-relative:text;mso-width-percent:0;mso-height-percent:0;mso-width-relative:margin;mso-height-relative:margin" from="-5.3pt,-.2pt" to="106.45pt,56.05pt" o:gfxdata="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" strokecolor="#00b050" strokeweight="3pt">
-                      <v:stroke joinstyle="miter"/>
-                    </v:line>
-                  </w:pict>
-                </mc:Fallback>
-              </mc:AlternateContent>
-            </w:r>
-            <w:r>
-              <w:rPr>
-                <w:rFonts w:asciiTheme="minorHAnsi" w:eastAsiaTheme="minorEastAsia" w:hAnsiTheme="minorHAnsi" w:cstheme="minorBidi"/>
-                <w:b/>
-                <w:bCs/>
-                <w:noProof/>
-                <w:sz w:val="22"/>
-                <w:szCs w:val="22"/>
-              </w:rPr>
-              <mc:AlternateContent>
-                <mc:Choice Requires="wps">
-                  <w:drawing>
-                    <wp:anchor distT="0" distB="0" distL="114300" distR="114300" simplePos="0" relativeHeight="251673600" behindDoc="0" locked="0" layoutInCell="1" allowOverlap="1" wp14:anchorId="2B51DF43" wp14:editId="18EE2A2A">
-                      <wp:simplePos x="0" y="0"/>
-                      <wp:positionH relativeFrom="column">
-                        <wp:posOffset>-95885</wp:posOffset>
-                      </wp:positionH>
-                      <wp:positionV relativeFrom="paragraph">
-                        <wp:posOffset>-21591</wp:posOffset>
-                      </wp:positionV>
-                      <wp:extent cx="1438275" cy="733425"/>
-                      <wp:effectExtent l="19050" t="19050" r="9525" b="28575"/>
-                      <wp:wrapNone/>
-                      <wp:docPr id="400309961" name="Conector recto 5"/>
-                      <wp:cNvGraphicFramePr/>
-                      <a:graphic xmlns:a="http://schemas.openxmlformats.org/drawingml/2006/main">
-                        <a:graphicData uri="http://schemas.microsoft.com/office/word/2010/wordprocessingShape">
-                          <wps:wsp>
-                            <wps:cNvCnPr/>
-                            <wps:spPr>
-                              <a:xfrm flipH="1" flipV="1">
-                                <a:off x="0" y="0"/>
-                                <a:ext cx="1438275" cy="733425"/>
-                              </a:xfrm>
-                              <a:prstGeom prst="line">
-                                <a:avLst/>
-                              </a:prstGeom>
-                              <a:ln w="38100">
-                                <a:solidFill>
-                                  <a:srgbClr val="00B050"/>
-                                </a:solidFill>
-                              </a:ln>
-                            </wps:spPr>
-                            <wps:style>
-                              <a:lnRef idx="1">
-                                <a:schemeClr val="accent1"/>
-                              </a:lnRef>
-                              <a:fillRef idx="0">
-                                <a:schemeClr val="accent1"/>
-                              </a:fillRef>
-                              <a:effectRef idx="0">
-                                <a:schemeClr val="accent1"/>
-                              </a:effectRef>
-                              <a:fontRef idx="minor">
-                                <a:schemeClr val="tx1"/>
-                              </a:fontRef>
-                            </wps:style>
-                            <wps:bodyPr/>
-                          </wps:wsp>
-                        </a:graphicData>
-                      </a:graphic>
-                      <wp14:sizeRelH relativeFrom="margin">
-                        <wp14:pctWidth>0</wp14:pctWidth>
-                      </wp14:sizeRelH>
-                      <wp14:sizeRelV relativeFrom="margin">
-                        <wp14:pctHeight>0</wp14:pctHeight>
-                      </wp14:sizeRelV>
-                    </wp:anchor>
-                  </w:drawing>
-                </mc:Choice>
-                <mc:Fallback>
-                  <w:pict>
-                    <v:line w14:anchorId="4FC00BC3" id="Conector recto 5" o:spid="_x0000_s1026" style="position:absolute;flip:x y;z-index:251673600;visibility:visible;mso-wrap-style:square;mso-width-percent:0;mso-height-percent:0;mso-wrap-distance-left:9pt;mso-wrap-distance-top:0;mso-wrap-distance-right:9pt;mso-wrap-distance-bottom:0;mso-position-horizontal:absolute;mso-position-horizontal-relative:text;mso-position-vertical:absolute;mso-position-vertical-relative:text;mso-width-percent:0;mso-height-percent:0;mso-width-relative:margin;mso-height-relative:margin" from="-7.55pt,-1.7pt" to="105.7pt,56.05pt" o:gfxdata="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" strokecolor="#00b050" strokeweight="3pt">
-                      <v:stroke joinstyle="miter"/>
-                    </v:line>
-                  </w:pict>
-                </mc:Fallback>
-              </mc:AlternateContent>
-            </w:r>
-            <w:r>
-              <w:rPr>
-                <w:rFonts w:asciiTheme="minorHAnsi" w:eastAsiaTheme="minorEastAsia" w:hAnsiTheme="minorHAnsi" w:cstheme="minorBidi"/>
-                <w:lang w:eastAsia="es-CL"/>
-              </w:rPr>
               <w:t xml:space="preserve">El informe cumple con el 100% de los indicadores de calidad disciplinarios </w:t>
             </w:r>
             <w:r>
@@ -6929,81 +6164,9 @@
             <w:r>
               <w:rPr>
                 <w:rFonts w:asciiTheme="minorHAnsi" w:eastAsiaTheme="minorEastAsia" w:hAnsiTheme="minorHAnsi" w:cstheme="minorBidi"/>
-                <w:b/>
-                <w:bCs/>
-                <w:noProof/>
-                <w:sz w:val="22"/>
-                <w:szCs w:val="22"/>
-              </w:rPr>
-              <mc:AlternateContent>
-                <mc:Choice Requires="wps">
-                  <w:drawing>
-                    <wp:anchor distT="0" distB="0" distL="114300" distR="114300" simplePos="0" relativeHeight="251677696" behindDoc="0" locked="0" layoutInCell="1" allowOverlap="1" wp14:anchorId="2D7BF275" wp14:editId="79E0075B">
-                      <wp:simplePos x="0" y="0"/>
-                      <wp:positionH relativeFrom="column">
-                        <wp:posOffset>-77471</wp:posOffset>
-                      </wp:positionH>
-                      <wp:positionV relativeFrom="paragraph">
-                        <wp:posOffset>-4445</wp:posOffset>
-                      </wp:positionV>
-                      <wp:extent cx="773083" cy="190500"/>
-                      <wp:effectExtent l="19050" t="19050" r="8255" b="19050"/>
-                      <wp:wrapNone/>
-                      <wp:docPr id="132084733" name="Conector recto 5"/>
-                      <wp:cNvGraphicFramePr/>
-                      <a:graphic xmlns:a="http://schemas.openxmlformats.org/drawingml/2006/main">
-                        <a:graphicData uri="http://schemas.microsoft.com/office/word/2010/wordprocessingShape">
-                          <wps:wsp>
-                            <wps:cNvCnPr/>
-                            <wps:spPr>
-                              <a:xfrm flipH="1" flipV="1">
-                                <a:off x="0" y="0"/>
-                                <a:ext cx="773083" cy="190500"/>
-                              </a:xfrm>
-                              <a:prstGeom prst="line">
-                                <a:avLst/>
-                              </a:prstGeom>
-                              <a:ln w="38100">
-                                <a:solidFill>
-                                  <a:srgbClr val="00B050"/>
-                                </a:solidFill>
-                              </a:ln>
-                            </wps:spPr>
-                            <wps:style>
-                              <a:lnRef idx="1">
-                                <a:schemeClr val="accent1"/>
-                              </a:lnRef>
-                              <a:fillRef idx="0">
-                                <a:schemeClr val="accent1"/>
-                              </a:fillRef>
-                              <a:effectRef idx="0">
-                                <a:schemeClr val="accent1"/>
-                              </a:effectRef>
-                              <a:fontRef idx="minor">
-                                <a:schemeClr val="tx1"/>
-                              </a:fontRef>
-                            </wps:style>
-                            <wps:bodyPr/>
-                          </wps:wsp>
-                        </a:graphicData>
-                      </a:graphic>
-                      <wp14:sizeRelH relativeFrom="margin">
-                        <wp14:pctWidth>0</wp14:pctWidth>
-                      </wp14:sizeRelH>
-                      <wp14:sizeRelV relativeFrom="margin">
-                        <wp14:pctHeight>0</wp14:pctHeight>
-                      </wp14:sizeRelV>
-                    </wp:anchor>
-                  </w:drawing>
-                </mc:Choice>
-                <mc:Fallback>
-                  <w:pict>
-                    <v:line w14:anchorId="37C769EB" id="Conector recto 5" o:spid="_x0000_s1026" style="position:absolute;flip:x y;z-index:251677696;visibility:visible;mso-wrap-style:square;mso-width-percent:0;mso-height-percent:0;mso-wrap-distance-left:9pt;mso-wrap-distance-top:0;mso-wrap-distance-right:9pt;mso-wrap-distance-bottom:0;mso-position-horizontal:absolute;mso-position-horizontal-relative:text;mso-position-vertical:absolute;mso-position-vertical-relative:text;mso-width-percent:0;mso-height-percent:0;mso-width-relative:margin;mso-height-relative:margin" from="-6.1pt,-.35pt" to="54.75pt,14.65pt" o:gfxdata="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" strokecolor="#00b050" strokeweight="3pt">
-                      <v:stroke joinstyle="miter"/>
-                    </v:line>
-                  </w:pict>
-                </mc:Fallback>
-              </mc:AlternateContent>
+                <w:lang w:eastAsia="es-CL"/>
+              </w:rPr>
+              <w:t>X</w:t>
             </w:r>
           </w:p>
         </w:tc>
@@ -7059,82 +6222,6 @@
                 <w:lang w:eastAsia="es-CL"/>
               </w:rPr>
             </w:pPr>
-            <w:r>
-              <w:rPr>
-                <w:rFonts w:asciiTheme="minorHAnsi" w:eastAsiaTheme="minorEastAsia" w:hAnsiTheme="minorHAnsi" w:cstheme="minorBidi"/>
-                <w:noProof/>
-                <w:color w:val="3B3838" w:themeColor="background2" w:themeShade="40"/>
-              </w:rPr>
-              <mc:AlternateContent>
-                <mc:Choice Requires="wps">
-                  <w:drawing>
-                    <wp:anchor distT="0" distB="0" distL="114300" distR="114300" simplePos="0" relativeHeight="251679744" behindDoc="0" locked="0" layoutInCell="1" allowOverlap="1" wp14:anchorId="39E7D1B2" wp14:editId="0CE40195">
-                      <wp:simplePos x="0" y="0"/>
-                      <wp:positionH relativeFrom="column">
-                        <wp:posOffset>-86995</wp:posOffset>
-                      </wp:positionH>
-                      <wp:positionV relativeFrom="paragraph">
-                        <wp:posOffset>-186691</wp:posOffset>
-                      </wp:positionV>
-                      <wp:extent cx="771525" cy="180975"/>
-                      <wp:effectExtent l="19050" t="19050" r="28575" b="28575"/>
-                      <wp:wrapNone/>
-                      <wp:docPr id="2113164210" name="Conector recto 6"/>
-                      <wp:cNvGraphicFramePr/>
-                      <a:graphic xmlns:a="http://schemas.openxmlformats.org/drawingml/2006/main">
-                        <a:graphicData uri="http://schemas.microsoft.com/office/word/2010/wordprocessingShape">
-                          <wps:wsp>
-                            <wps:cNvCnPr/>
-                            <wps:spPr>
-                              <a:xfrm flipV="1">
-                                <a:off x="0" y="0"/>
-                                <a:ext cx="771525" cy="180975"/>
-                              </a:xfrm>
-                              <a:prstGeom prst="line">
-                                <a:avLst/>
-                              </a:prstGeom>
-                              <a:ln w="38100">
-                                <a:solidFill>
-                                  <a:srgbClr val="00B050"/>
-                                </a:solidFill>
-                              </a:ln>
-                            </wps:spPr>
-                            <wps:style>
-                              <a:lnRef idx="1">
-                                <a:schemeClr val="accent1"/>
-                              </a:lnRef>
-                              <a:fillRef idx="0">
-                                <a:schemeClr val="accent1"/>
-                              </a:fillRef>
-                              <a:effectRef idx="0">
-                                <a:schemeClr val="accent1"/>
-                              </a:effectRef>
-                              <a:fontRef idx="minor">
-                                <a:schemeClr val="tx1"/>
-                              </a:fontRef>
-                            </wps:style>
-                            <wps:bodyPr/>
-                          </wps:wsp>
-                        </a:graphicData>
-                      </a:graphic>
-                      <wp14:sizeRelH relativeFrom="margin">
-                        <wp14:pctWidth>0</wp14:pctWidth>
-                      </wp14:sizeRelH>
-                      <wp14:sizeRelV relativeFrom="margin">
-                        <wp14:pctHeight>0</wp14:pctHeight>
-                      </wp14:sizeRelV>
-                    </wp:anchor>
-                  </w:drawing>
-                </mc:Choice>
-                <mc:Fallback>
-                  <w:pict>
-                    <v:line w14:anchorId="4428333A" id="Conector recto 6" o:spid="_x0000_s1026" style="position:absolute;flip:y;z-index:251679744;visibility:visible;mso-wrap-style:square;mso-width-percent:0;mso-height-percent:0;mso-wrap-distance-left:9pt;mso-wrap-distance-top:0;mso-wrap-distance-right:9pt;mso-wrap-distance-bottom:0;mso-position-horizontal:absolute;mso-position-horizontal-relative:text;mso-position-vertical:absolute;mso-position-vertical-relative:text;mso-width-percent:0;mso-height-percent:0;mso-width-relative:margin;mso-height-relative:margin" from="-6.85pt,-14.7pt" to="53.9pt,-.45pt" o:gfxdata="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" strokecolor="#00b050" strokeweight="3pt">
-                      <v:stroke joinstyle="miter"/>
-                    </v:line>
-                  </w:pict>
-                </mc:Fallback>
-              </mc:AlternateContent>
-            </w:r>
           </w:p>
         </w:tc>
       </w:tr>
@@ -12397,16 +11484,15 @@
 </file>
 
 <file path=customXml/item2.xml><?xml version="1.0" encoding="utf-8"?>
-<p:properties xmlns:p="http://schemas.microsoft.com/office/2006/metadata/properties" xmlns:xsi="http://www.w3.org/2001/XMLSchema-instance" xmlns:pc="http://schemas.microsoft.com/office/infopath/2007/PartnerControls">
-  <documentManagement/>
-</p:properties>
+<?mso-contentType ?>
+<FormTemplates xmlns="http://schemas.microsoft.com/sharepoint/v3/contenttype/forms">
+  <Display>DocumentLibraryForm</Display>
+  <Edit>DocumentLibraryForm</Edit>
+  <New>DocumentLibraryForm</New>
+</FormTemplates>
 </file>
 
 <file path=customXml/item3.xml><?xml version="1.0" encoding="utf-8"?>
-<b:Sources xmlns:b="http://schemas.openxmlformats.org/officeDocument/2006/bibliography" xmlns="http://schemas.openxmlformats.org/officeDocument/2006/bibliography" SelectedStyle="\APASixthEditionOfficeOnline.xsl" StyleName="APA" Version="6"/>
-</file>
-
-<file path=customXml/item4.xml><?xml version="1.0" encoding="utf-8"?>
 <ct:contentTypeSchema xmlns:ct="http://schemas.microsoft.com/office/2006/metadata/contentType" xmlns:ma="http://schemas.microsoft.com/office/2006/metadata/properties/metaAttributes" ct:_="" ma:_="" ma:contentTypeName="Documento" ma:contentTypeID="0x010100E96778489EE7714D8BD12CC105EB918B" ma:contentTypeVersion="2" ma:contentTypeDescription="Crear nuevo documento." ma:contentTypeScope="" ma:versionID="416c5c7ae9b5d54d83875cd3c65194e3">
   <xsd:schema xmlns:xsd="http://www.w3.org/2001/XMLSchema" xmlns:xs="http://www.w3.org/2001/XMLSchema" xmlns:p="http://schemas.microsoft.com/office/2006/metadata/properties" xmlns:ns2="126e8a1c-9ea9-435a-ac89-d06c80d62e30" targetNamespace="http://schemas.microsoft.com/office/2006/metadata/properties" ma:root="true" ma:fieldsID="70a237c842677bd850644f8595079f5e" ns2:_="">
     <xsd:import namespace="126e8a1c-9ea9-435a-ac89-d06c80d62e30"/>
@@ -12538,13 +11624,14 @@
 </ct:contentTypeSchema>
 </file>
 
+<file path=customXml/item4.xml><?xml version="1.0" encoding="utf-8"?>
+<b:Sources xmlns:b="http://schemas.openxmlformats.org/officeDocument/2006/bibliography" xmlns="http://schemas.openxmlformats.org/officeDocument/2006/bibliography" SelectedStyle="\APASixthEditionOfficeOnline.xsl" StyleName="APA" Version="6"/>
+</file>
+
 <file path=customXml/item5.xml><?xml version="1.0" encoding="utf-8"?>
-<?mso-contentType ?>
-<FormTemplates xmlns="http://schemas.microsoft.com/sharepoint/v3/contenttype/forms">
-  <Display>DocumentLibraryForm</Display>
-  <Edit>DocumentLibraryForm</Edit>
-  <New>DocumentLibraryForm</New>
-</FormTemplates>
+<p:properties xmlns:p="http://schemas.microsoft.com/office/2006/metadata/properties" xmlns:xsi="http://www.w3.org/2001/XMLSchema-instance" xmlns:pc="http://schemas.microsoft.com/office/infopath/2007/PartnerControls">
+  <documentManagement/>
+</p:properties>
 </file>
 
 <file path=customXml/itemProps1.xml><?xml version="1.0" encoding="utf-8"?>
@@ -12556,23 +11643,14 @@
 </file>
 
 <file path=customXml/itemProps2.xml><?xml version="1.0" encoding="utf-8"?>
-<ds:datastoreItem xmlns:ds="http://schemas.openxmlformats.org/officeDocument/2006/customXml" ds:itemID="{5B7B5873-BEF7-4EF9-B783-7B50266FE496}">
+<ds:datastoreItem xmlns:ds="http://schemas.openxmlformats.org/officeDocument/2006/customXml" ds:itemID="{4EF1E242-F579-4982-B8CC-2FBF33737424}">
   <ds:schemaRefs>
-    <ds:schemaRef ds:uri="http://schemas.microsoft.com/office/2006/metadata/properties"/>
-    <ds:schemaRef ds:uri="http://schemas.microsoft.com/office/infopath/2007/PartnerControls"/>
+    <ds:schemaRef ds:uri="http://schemas.microsoft.com/sharepoint/v3/contenttype/forms"/>
   </ds:schemaRefs>
 </ds:datastoreItem>
 </file>
 
 <file path=customXml/itemProps3.xml><?xml version="1.0" encoding="utf-8"?>
-<ds:datastoreItem xmlns:ds="http://schemas.openxmlformats.org/officeDocument/2006/customXml" ds:itemID="{74203E96-B722-44CF-B611-70923DD4F702}">
-  <ds:schemaRefs>
-    <ds:schemaRef ds:uri="http://schemas.openxmlformats.org/officeDocument/2006/bibliography"/>
-  </ds:schemaRefs>
-</ds:datastoreItem>
-</file>
-
-<file path=customXml/itemProps4.xml><?xml version="1.0" encoding="utf-8"?>
 <ds:datastoreItem xmlns:ds="http://schemas.openxmlformats.org/officeDocument/2006/customXml" ds:itemID="{12C339A1-A9A3-4F86-8BF7-5C7340ED2ECA}">
   <ds:schemaRefs>
     <ds:schemaRef ds:uri="http://schemas.microsoft.com/office/2006/metadata/contentType"/>
@@ -12590,10 +11668,19 @@
 </ds:datastoreItem>
 </file>
 
+<file path=customXml/itemProps4.xml><?xml version="1.0" encoding="utf-8"?>
+<ds:datastoreItem xmlns:ds="http://schemas.openxmlformats.org/officeDocument/2006/customXml" ds:itemID="{74203E96-B722-44CF-B611-70923DD4F702}">
+  <ds:schemaRefs>
+    <ds:schemaRef ds:uri="http://schemas.openxmlformats.org/officeDocument/2006/bibliography"/>
+  </ds:schemaRefs>
+</ds:datastoreItem>
+</file>
+
 <file path=customXml/itemProps5.xml><?xml version="1.0" encoding="utf-8"?>
-<ds:datastoreItem xmlns:ds="http://schemas.openxmlformats.org/officeDocument/2006/customXml" ds:itemID="{4EF1E242-F579-4982-B8CC-2FBF33737424}">
+<ds:datastoreItem xmlns:ds="http://schemas.openxmlformats.org/officeDocument/2006/customXml" ds:itemID="{5B7B5873-BEF7-4EF9-B783-7B50266FE496}">
   <ds:schemaRefs>
-    <ds:schemaRef ds:uri="http://schemas.microsoft.com/sharepoint/v3/contenttype/forms"/>
+    <ds:schemaRef ds:uri="http://schemas.microsoft.com/office/2006/metadata/properties"/>
+    <ds:schemaRef ds:uri="http://schemas.microsoft.com/office/infopath/2007/PartnerControls"/>
   </ds:schemaRefs>
 </ds:datastoreItem>
 </file>
</xml_diff>

<commit_message>
Corrección de formatos para: 1.4, 1.3_Araceli_Vega, 1.3_Benjamin_Mateluna; Subida de documento 1.3_Kryshsna_Cerda
</commit_message>
<xml_diff>
--- a/Fase 1/Evidencias Grupales/1.4_APT122_FormativaFase1.docx
+++ b/Fase 1/Evidencias Grupales/1.4_APT122_FormativaFase1.docx
@@ -4975,7 +4975,22 @@
                 <w:rFonts w:asciiTheme="minorHAnsi" w:eastAsiaTheme="minorEastAsia" w:hAnsiTheme="minorHAnsi" w:cstheme="minorBidi"/>
                 <w:color w:val="3B3838" w:themeColor="background2" w:themeShade="40"/>
               </w:rPr>
-              <w:t>Describe brevemente en qué consiste el proyecto APT, justificando la relevancia, impacto o beneficio (real o simulado) que tendría en el campo laboral de su carrera.</w:t>
+              <w:t xml:space="preserve">X </w:t>
+            </w:r>
+            <w:r>
+              <w:rPr>
+                <w:rFonts w:asciiTheme="minorHAnsi" w:eastAsiaTheme="minorEastAsia" w:hAnsiTheme="minorHAnsi" w:cstheme="minorBidi"/>
+                <w:color w:val="3B3838" w:themeColor="background2" w:themeShade="40"/>
+              </w:rPr>
+              <w:t xml:space="preserve">Describe brevemente en qué consiste el proyecto APT, justificando la relevancia, impacto o beneficio (real o simulado) que tendría en </w:t>
+            </w:r>
+            <w:r>
+              <w:rPr>
+                <w:rFonts w:asciiTheme="minorHAnsi" w:eastAsiaTheme="minorEastAsia" w:hAnsiTheme="minorHAnsi" w:cstheme="minorBidi"/>
+                <w:color w:val="3B3838" w:themeColor="background2" w:themeShade="40"/>
+              </w:rPr>
+              <w:lastRenderedPageBreak/>
+              <w:t>el campo laboral de su carrera.</w:t>
             </w:r>
           </w:p>
         </w:tc>
@@ -4997,6 +5012,7 @@
                 <w:rFonts w:asciiTheme="minorHAnsi" w:eastAsiaTheme="minorEastAsia" w:hAnsiTheme="minorHAnsi" w:cstheme="minorBidi"/>
                 <w:color w:val="3B3838" w:themeColor="background2" w:themeShade="40"/>
               </w:rPr>
+              <w:lastRenderedPageBreak/>
               <w:t xml:space="preserve">Describe brevemente en qué consiste el proyecto APT, señalando la relevancia, impacto o beneficio (real o simulado) que tendría, pero no queda clara la </w:t>
             </w:r>
             <w:r>
@@ -5150,6 +5166,13 @@
                 <w:rFonts w:asciiTheme="minorHAnsi" w:eastAsiaTheme="minorEastAsia" w:hAnsiTheme="minorHAnsi" w:cstheme="minorBidi"/>
                 <w:color w:val="3B3838" w:themeColor="background2" w:themeShade="40"/>
               </w:rPr>
+              <w:t xml:space="preserve">X </w:t>
+            </w:r>
+            <w:r>
+              <w:rPr>
+                <w:rFonts w:asciiTheme="minorHAnsi" w:eastAsiaTheme="minorEastAsia" w:hAnsiTheme="minorHAnsi" w:cstheme="minorBidi"/>
+                <w:color w:val="3B3838" w:themeColor="background2" w:themeShade="40"/>
+              </w:rPr>
               <w:t xml:space="preserve">Describe una relación coherente entre su proyecto y el perfil de egreso de su plan de estudio, especificando cómo debe utilizar distintas competencias para desarrollar su Proyecto APT. </w:t>
             </w:r>
           </w:p>
@@ -5326,6 +5349,13 @@
                 <w:rFonts w:asciiTheme="minorHAnsi" w:eastAsiaTheme="minorEastAsia" w:hAnsiTheme="minorHAnsi" w:cstheme="minorBidi"/>
                 <w:color w:val="3B3838" w:themeColor="background2" w:themeShade="40"/>
               </w:rPr>
+              <w:t xml:space="preserve">X </w:t>
+            </w:r>
+            <w:r>
+              <w:rPr>
+                <w:rFonts w:asciiTheme="minorHAnsi" w:eastAsiaTheme="minorEastAsia" w:hAnsiTheme="minorHAnsi" w:cstheme="minorBidi"/>
+                <w:color w:val="3B3838" w:themeColor="background2" w:themeShade="40"/>
+              </w:rPr>
               <w:t xml:space="preserve">Menciona sus intereses profesionales y explica con claridad cómo estos se ven reflejados en su proyecto. </w:t>
             </w:r>
           </w:p>
@@ -5479,6 +5509,13 @@
                 <w:rFonts w:asciiTheme="minorHAnsi" w:eastAsiaTheme="minorEastAsia" w:hAnsiTheme="minorHAnsi" w:cstheme="minorBidi"/>
                 <w:color w:val="3B3838" w:themeColor="background2" w:themeShade="40"/>
               </w:rPr>
+              <w:t xml:space="preserve">X </w:t>
+            </w:r>
+            <w:r>
+              <w:rPr>
+                <w:rFonts w:asciiTheme="minorHAnsi" w:eastAsiaTheme="minorEastAsia" w:hAnsiTheme="minorHAnsi" w:cstheme="minorBidi"/>
+                <w:color w:val="3B3838" w:themeColor="background2" w:themeShade="40"/>
+              </w:rPr>
               <w:t>Justifica por qué el proyecto puede desarrollarse considerado tiempo, materiales y factores externos, y en caso de posibles dificultades plantea como las abordaría.</w:t>
             </w:r>
           </w:p>
@@ -5715,7 +5752,14 @@
                 <w:lang w:eastAsia="es-CL"/>
               </w:rPr>
               <w:lastRenderedPageBreak/>
-              <w:t xml:space="preserve">El informe cumple con el 100% de los indicadores de calidad disciplinarios </w:t>
+              <w:t xml:space="preserve">X </w:t>
+            </w:r>
+            <w:r>
+              <w:rPr>
+                <w:rFonts w:asciiTheme="minorHAnsi" w:eastAsiaTheme="minorEastAsia" w:hAnsiTheme="minorHAnsi" w:cstheme="minorBidi"/>
+                <w:lang w:eastAsia="es-CL"/>
+              </w:rPr>
+              <w:t xml:space="preserve">El informe cumple con el 100% de los indicadores de calidad disciplinarios requeridos </w:t>
             </w:r>
             <w:r>
               <w:rPr>
@@ -5723,7 +5767,7 @@
                 <w:lang w:eastAsia="es-CL"/>
               </w:rPr>
               <w:lastRenderedPageBreak/>
-              <w:t>requeridos en el diseño del Proyecto APT.</w:t>
+              <w:t>en el diseño del Proyecto APT.</w:t>
             </w:r>
           </w:p>
         </w:tc>
@@ -11484,15 +11528,6 @@
 </file>
 
 <file path=customXml/item2.xml><?xml version="1.0" encoding="utf-8"?>
-<?mso-contentType ?>
-<FormTemplates xmlns="http://schemas.microsoft.com/sharepoint/v3/contenttype/forms">
-  <Display>DocumentLibraryForm</Display>
-  <Edit>DocumentLibraryForm</Edit>
-  <New>DocumentLibraryForm</New>
-</FormTemplates>
-</file>
-
-<file path=customXml/item3.xml><?xml version="1.0" encoding="utf-8"?>
 <ct:contentTypeSchema xmlns:ct="http://schemas.microsoft.com/office/2006/metadata/contentType" xmlns:ma="http://schemas.microsoft.com/office/2006/metadata/properties/metaAttributes" ct:_="" ma:_="" ma:contentTypeName="Documento" ma:contentTypeID="0x010100E96778489EE7714D8BD12CC105EB918B" ma:contentTypeVersion="2" ma:contentTypeDescription="Crear nuevo documento." ma:contentTypeScope="" ma:versionID="416c5c7ae9b5d54d83875cd3c65194e3">
   <xsd:schema xmlns:xsd="http://www.w3.org/2001/XMLSchema" xmlns:xs="http://www.w3.org/2001/XMLSchema" xmlns:p="http://schemas.microsoft.com/office/2006/metadata/properties" xmlns:ns2="126e8a1c-9ea9-435a-ac89-d06c80d62e30" targetNamespace="http://schemas.microsoft.com/office/2006/metadata/properties" ma:root="true" ma:fieldsID="70a237c842677bd850644f8595079f5e" ns2:_="">
     <xsd:import namespace="126e8a1c-9ea9-435a-ac89-d06c80d62e30"/>
@@ -11624,14 +11659,23 @@
 </ct:contentTypeSchema>
 </file>
 
+<file path=customXml/item3.xml><?xml version="1.0" encoding="utf-8"?>
+<?mso-contentType ?>
+<FormTemplates xmlns="http://schemas.microsoft.com/sharepoint/v3/contenttype/forms">
+  <Display>DocumentLibraryForm</Display>
+  <Edit>DocumentLibraryForm</Edit>
+  <New>DocumentLibraryForm</New>
+</FormTemplates>
+</file>
+
 <file path=customXml/item4.xml><?xml version="1.0" encoding="utf-8"?>
-<b:Sources xmlns:b="http://schemas.openxmlformats.org/officeDocument/2006/bibliography" xmlns="http://schemas.openxmlformats.org/officeDocument/2006/bibliography" SelectedStyle="\APASixthEditionOfficeOnline.xsl" StyleName="APA" Version="6"/>
+<p:properties xmlns:p="http://schemas.microsoft.com/office/2006/metadata/properties" xmlns:xsi="http://www.w3.org/2001/XMLSchema-instance" xmlns:pc="http://schemas.microsoft.com/office/infopath/2007/PartnerControls">
+  <documentManagement/>
+</p:properties>
 </file>
 
 <file path=customXml/item5.xml><?xml version="1.0" encoding="utf-8"?>
-<p:properties xmlns:p="http://schemas.microsoft.com/office/2006/metadata/properties" xmlns:xsi="http://www.w3.org/2001/XMLSchema-instance" xmlns:pc="http://schemas.microsoft.com/office/infopath/2007/PartnerControls">
-  <documentManagement/>
-</p:properties>
+<b:Sources xmlns:b="http://schemas.openxmlformats.org/officeDocument/2006/bibliography" xmlns="http://schemas.openxmlformats.org/officeDocument/2006/bibliography" SelectedStyle="\APASixthEditionOfficeOnline.xsl" StyleName="APA" Version="6"/>
 </file>
 
 <file path=customXml/itemProps1.xml><?xml version="1.0" encoding="utf-8"?>
@@ -11643,14 +11687,6 @@
 </file>
 
 <file path=customXml/itemProps2.xml><?xml version="1.0" encoding="utf-8"?>
-<ds:datastoreItem xmlns:ds="http://schemas.openxmlformats.org/officeDocument/2006/customXml" ds:itemID="{4EF1E242-F579-4982-B8CC-2FBF33737424}">
-  <ds:schemaRefs>
-    <ds:schemaRef ds:uri="http://schemas.microsoft.com/sharepoint/v3/contenttype/forms"/>
-  </ds:schemaRefs>
-</ds:datastoreItem>
-</file>
-
-<file path=customXml/itemProps3.xml><?xml version="1.0" encoding="utf-8"?>
 <ds:datastoreItem xmlns:ds="http://schemas.openxmlformats.org/officeDocument/2006/customXml" ds:itemID="{12C339A1-A9A3-4F86-8BF7-5C7340ED2ECA}">
   <ds:schemaRefs>
     <ds:schemaRef ds:uri="http://schemas.microsoft.com/office/2006/metadata/contentType"/>
@@ -11668,19 +11704,27 @@
 </ds:datastoreItem>
 </file>
 
-<file path=customXml/itemProps4.xml><?xml version="1.0" encoding="utf-8"?>
-<ds:datastoreItem xmlns:ds="http://schemas.openxmlformats.org/officeDocument/2006/customXml" ds:itemID="{74203E96-B722-44CF-B611-70923DD4F702}">
+<file path=customXml/itemProps3.xml><?xml version="1.0" encoding="utf-8"?>
+<ds:datastoreItem xmlns:ds="http://schemas.openxmlformats.org/officeDocument/2006/customXml" ds:itemID="{4EF1E242-F579-4982-B8CC-2FBF33737424}">
   <ds:schemaRefs>
-    <ds:schemaRef ds:uri="http://schemas.openxmlformats.org/officeDocument/2006/bibliography"/>
+    <ds:schemaRef ds:uri="http://schemas.microsoft.com/sharepoint/v3/contenttype/forms"/>
   </ds:schemaRefs>
 </ds:datastoreItem>
 </file>
 
-<file path=customXml/itemProps5.xml><?xml version="1.0" encoding="utf-8"?>
+<file path=customXml/itemProps4.xml><?xml version="1.0" encoding="utf-8"?>
 <ds:datastoreItem xmlns:ds="http://schemas.openxmlformats.org/officeDocument/2006/customXml" ds:itemID="{5B7B5873-BEF7-4EF9-B783-7B50266FE496}">
   <ds:schemaRefs>
     <ds:schemaRef ds:uri="http://schemas.microsoft.com/office/2006/metadata/properties"/>
     <ds:schemaRef ds:uri="http://schemas.microsoft.com/office/infopath/2007/PartnerControls"/>
   </ds:schemaRefs>
 </ds:datastoreItem>
+</file>
+
+<file path=customXml/itemProps5.xml><?xml version="1.0" encoding="utf-8"?>
+<ds:datastoreItem xmlns:ds="http://schemas.openxmlformats.org/officeDocument/2006/customXml" ds:itemID="{74203E96-B722-44CF-B611-70923DD4F702}">
+  <ds:schemaRefs>
+    <ds:schemaRef ds:uri="http://schemas.openxmlformats.org/officeDocument/2006/bibliography"/>
+  </ds:schemaRefs>
+</ds:datastoreItem>
 </file>
</xml_diff>